<commit_message>
Movements, not moments; the Guidelines match Journaler
Todd's word: the four stages of currere are movements. Changed on
Wednesday's page, the four-moments sheet (URL kept), the home page, the
Guidelines, and the Final Draft handout, with a line crediting the
change. The scene sense of moment is left alone, as are pages already
taught.

The Guidelines and the Final Draft handout now say only the first two
movements are timed gushes, keep the analytical out of AI's hands, name
the thread-coach use, and label the end prompt as the final-draft one.

Co-Authored-By: Claude Opus 5.5 <noreply@anthropic.com>
</commit_message>
<xml_diff>
--- a/week-06-what-is-currere/Currere Guidelines.docx
+++ b/week-06-what-is-currere/Currere Guidelines.docx
@@ -129,7 +129,7 @@
           <w:sz w:val="22"/>
           <w:szCs w:val="22"/>
         </w:rPr>
-        <w:t>You write a currere by moving through four kinds of attention, in order. Each begins as a timed gush in Journaler — gather the material, then build.</w:t>
+        <w:t>You write a currere by moving through four kinds of attention, in order. All four live in Journaler’s Currere tab. The first two are timed gushes — gather the material, then build. The analytical sets those two gushes side by side, and the synthetical is an open draft with no timer.</w:t>
       </w:r>
     </w:p>
     <w:p>
@@ -292,7 +292,7 @@
           <w:sz w:val="22"/>
           <w:szCs w:val="22"/>
         </w:rPr>
-        <w:t>There’s no set shape, either. Two come up often: an open currere breaks into named parts that walk the four moments (see J. Edwards, “Beyond Presence”); a braided one runs as one piece with an interior voice, holding its meaning until it lands late (see M. T. Edwards, “Who’s Cheating Whom?”). Neither is right — let your thread decide. For endings, notice how Daspit, Romano, and Bird each land their closes.</w:t>
+        <w:t>There’s no set shape, either. Two come up often: an open currere breaks into named parts that walk the four movements (see J. Edwards, “Beyond Presence”); a braided one runs as one piece with an interior voice, holding its meaning until it lands late (see M. T. Edwards, “Who’s Cheating Whom?”). Neither is right — let your thread decide. For endings, notice how Daspit, Romano, and Bird each land their closes.</w:t>
       </w:r>
     </w:p>
     <w:p>
@@ -371,7 +371,7 @@
           <w:sz w:val="22"/>
           <w:szCs w:val="22"/>
         </w:rPr>
-        <w:t xml:space="preserve"> asks how the writing went — about the experience of remembering, never supplying your words; in the analytical moment, paste your own bursts and ask what themes recur; in revision, ask whether a scene is clear and vivid — a craft consultant, not a ghostwriter.</w:t>
+        <w:t xml:space="preserve"> asks how the writing went — about the experience of remembering, never supplying your words; before your topic conference, Todd-in-a-Can reads your candidate threads and asks which has the most room, without choosing for you; and in revision, ask whether a scene is clear and vivid — a craft consultant, not a ghostwriter. The analytical stays yours: Journaler sets your gushes side by side and counts the threads you name, but finding what recurs is the work, so no AI does it for you.</w:t>
       </w:r>
     </w:p>
     <w:p>
@@ -800,7 +800,7 @@
           <w:sz w:val="22"/>
           <w:szCs w:val="22"/>
         </w:rPr>
-        <w:t>Todd-in-a-Can prompt — paste this in with your draft:</w:t>
+        <w:t>Todd-in-a-Can prompt for your final draft — use it when you revise, later. (Choosing a thread? That prompt is at the end of the Conference Packet.)</w:t>
       </w:r>
     </w:p>
     <w:tbl>

</xml_diff>

<commit_message>
Week 6: count-off group work, five-curreres table, sheet and tester fixes
Cut the half-sheet section from the four-movements sheet and ask for notes
instead. Wednesday: count off by fives, 5 min in groups, 5 min against the
sheet, 5 min debrief. List the five curreres in housekeeping. Correct the
Daspit and Wiederhold progressive notes, and tighten the tester's progressive
definition so it stops finding daydreams and bare intentions.

Co-Authored-By: Claude Opus 5.5 <noreply@anthropic.com>
</commit_message>
<xml_diff>
--- a/week-06-what-is-currere/Currere Guidelines.docx
+++ b/week-06-what-is-currere/Currere Guidelines.docx
@@ -1,20 +1,24 @@
 
 <file path=word/document.xml><?xml version="1.0" encoding="utf-8"?>
-<w:document xmlns:o="urn:schemas-microsoft-com:office:office" xmlns:r="http://schemas.openxmlformats.org/officeDocument/2006/relationships" xmlns:v="urn:schemas-microsoft-com:vml" xmlns:w="http://schemas.openxmlformats.org/wordprocessingml/2006/main" xmlns:w10="urn:schemas-microsoft-com:office:word" xmlns:wp="http://schemas.openxmlformats.org/drawingml/2006/wordprocessingDrawing" xmlns:wps="http://schemas.microsoft.com/office/word/2010/wordprocessingShape" xmlns:wpg="http://schemas.microsoft.com/office/word/2010/wordprocessingGroup" xmlns:mc="http://schemas.openxmlformats.org/markup-compatibility/2006" xmlns:wp14="http://schemas.microsoft.com/office/word/2010/wordprocessingDrawing" xmlns:w14="http://schemas.microsoft.com/office/word/2010/wordml" xmlns:w15="http://schemas.microsoft.com/office/word/2012/wordml" mc:Ignorable="w14 wp14 w15">
+<w:document xmlns:o="urn:schemas-microsoft-com:office:office" xmlns:r="http://schemas.openxmlformats.org/officeDocument/2006/relationships" xmlns:v="urn:schemas-microsoft-com:vml" xmlns:w="http://schemas.openxmlformats.org/wordprocessingml/2006/main" xmlns:w10="urn:schemas-microsoft-com:office:word" xmlns:wp="http://schemas.openxmlformats.org/drawingml/2006/wordprocessingDrawing" xmlns:pic="http://schemas.openxmlformats.org/drawingml/2006/picture" xmlns:wps="http://schemas.microsoft.com/office/word/2010/wordprocessingShape" xmlns:wpg="http://schemas.microsoft.com/office/word/2010/wordprocessingGroup" xmlns:mc="http://schemas.openxmlformats.org/markup-compatibility/2006" xmlns:wp14="http://schemas.microsoft.com/office/word/2010/wordprocessingDrawing" xmlns:w14="http://schemas.microsoft.com/office/word/2010/wordml" xmlns:w15="http://schemas.microsoft.com/office/word/2012/wordml" mc:Ignorable="w14 wp14 w15">
   <w:body>
     <w:p>
       <w:pPr>
         <w:pStyle w:val="normal1"/>
         <w:spacing w:before="0" w:after="0"/>
-        <w:rPr/>
-      </w:pPr>
-      <w:r>
-        <w:rPr>
-          <w:rFonts w:eastAsia="Calibri" w:cs="Calibri"/>
+        <w:rPr>
+          <w:rFonts w:ascii="Calibri" w:hAnsi="Calibri"/>
+          <w:sz w:val="21"/>
+          <w:szCs w:val="21"/>
+        </w:rPr>
+      </w:pPr>
+      <w:r>
+        <w:rPr>
+          <w:rFonts w:eastAsia="Calibri" w:cs="Calibri" w:ascii="Calibri" w:hAnsi="Calibri"/>
           <w:b/>
           <w:bCs/>
-          <w:sz w:val="24"/>
-          <w:szCs w:val="22"/>
+          <w:sz w:val="21"/>
+          <w:szCs w:val="21"/>
         </w:rPr>
         <w:t>Your Currere — Final Draft</w:t>
       </w:r>
@@ -23,15 +27,19 @@
       <w:pPr>
         <w:pStyle w:val="normal1"/>
         <w:spacing w:before="0" w:after="0"/>
-        <w:rPr/>
-      </w:pPr>
-      <w:r>
-        <w:rPr>
-          <w:rFonts w:eastAsia="Calibri" w:cs="Calibri"/>
+        <w:rPr>
+          <w:rFonts w:ascii="Calibri" w:hAnsi="Calibri"/>
+          <w:sz w:val="21"/>
+          <w:szCs w:val="21"/>
+        </w:rPr>
+      </w:pPr>
+      <w:r>
+        <w:rPr>
+          <w:rFonts w:eastAsia="Calibri" w:cs="Calibri" w:ascii="Calibri" w:hAnsi="Calibri"/>
           <w:b/>
           <w:bCs/>
-          <w:sz w:val="24"/>
-          <w:szCs w:val="22"/>
+          <w:sz w:val="21"/>
+          <w:szCs w:val="21"/>
         </w:rPr>
         <w:t>TCE 284 FA26 (Edwards)</w:t>
       </w:r>
@@ -40,15 +48,19 @@
       <w:pPr>
         <w:pStyle w:val="normal1"/>
         <w:spacing w:before="0" w:after="0"/>
-        <w:rPr/>
-      </w:pPr>
-      <w:r>
-        <w:rPr>
-          <w:rFonts w:eastAsia="Calibri" w:cs="Calibri"/>
+        <w:rPr>
+          <w:rFonts w:ascii="Calibri" w:hAnsi="Calibri"/>
+          <w:sz w:val="21"/>
+          <w:szCs w:val="21"/>
+        </w:rPr>
+      </w:pPr>
+      <w:r>
+        <w:rPr>
+          <w:rFonts w:eastAsia="Calibri" w:cs="Calibri" w:ascii="Calibri" w:hAnsi="Calibri"/>
           <w:b/>
           <w:bCs/>
-          <w:sz w:val="24"/>
-          <w:szCs w:val="22"/>
+          <w:sz w:val="21"/>
+          <w:szCs w:val="21"/>
         </w:rPr>
         <w:t>30 points possible</w:t>
       </w:r>
@@ -56,16 +68,20 @@
     <w:p>
       <w:pPr>
         <w:pStyle w:val="Heading2"/>
-        <w:rPr/>
-      </w:pPr>
-      <w:r>
-        <w:rPr>
-          <w:rFonts w:eastAsia="Calibri" w:cs="Calibri"/>
+        <w:rPr>
+          <w:rFonts w:ascii="Calibri" w:hAnsi="Calibri"/>
+          <w:sz w:val="21"/>
+          <w:szCs w:val="21"/>
+        </w:rPr>
+      </w:pPr>
+      <w:r>
+        <w:rPr>
+          <w:rFonts w:eastAsia="Calibri" w:cs="Calibri" w:ascii="Calibri" w:hAnsi="Calibri"/>
           <w:b/>
           <w:bCs/>
           <w:color w:val="4F81BD"/>
-          <w:sz w:val="26"/>
-          <w:szCs w:val="26"/>
+          <w:sz w:val="21"/>
+          <w:szCs w:val="21"/>
         </w:rPr>
         <w:t>1. What’s This All About?</w:t>
       </w:r>
@@ -74,13 +90,17 @@
       <w:pPr>
         <w:pStyle w:val="normal1"/>
         <w:spacing w:lineRule="auto" w:line="276" w:before="0" w:after="200"/>
-        <w:rPr/>
-      </w:pPr>
-      <w:r>
-        <w:rPr>
-          <w:rFonts w:eastAsia="Calibri" w:cs="Calibri"/>
-          <w:sz w:val="22"/>
-          <w:szCs w:val="22"/>
+        <w:rPr>
+          <w:rFonts w:ascii="Calibri" w:hAnsi="Calibri"/>
+          <w:sz w:val="21"/>
+          <w:szCs w:val="21"/>
+        </w:rPr>
+      </w:pPr>
+      <w:r>
+        <w:rPr>
+          <w:rFonts w:eastAsia="Calibri" w:cs="Calibri" w:ascii="Calibri" w:hAnsi="Calibri"/>
+          <w:sz w:val="21"/>
+          <w:szCs w:val="21"/>
         </w:rPr>
         <w:t>Currere is Latin for “to run,” the way a current runs — an autobiographical method William Pinar built to help you understand your own life in schools and what it is making you into as a teacher. Act I taught you the part of it that takes up the most room: putting a reader inside a real moment from your own life. What is new here is stepping back from that moment to say what it means, and reaching forward into a future you have not lived yet. This is the full version, sustained on one thread that matters to you. The Final Draft is the finished piece, due Friday, October 30.</w:t>
       </w:r>
@@ -89,13 +109,17 @@
       <w:pPr>
         <w:pStyle w:val="normal1"/>
         <w:spacing w:lineRule="auto" w:line="276" w:before="0" w:after="200"/>
-        <w:rPr/>
-      </w:pPr>
-      <w:r>
-        <w:rPr>
-          <w:rFonts w:eastAsia="Calibri" w:cs="Calibri"/>
-          <w:sz w:val="22"/>
-          <w:szCs w:val="22"/>
+        <w:rPr>
+          <w:rFonts w:ascii="Calibri" w:hAnsi="Calibri"/>
+          <w:sz w:val="21"/>
+          <w:szCs w:val="21"/>
+        </w:rPr>
+      </w:pPr>
+      <w:r>
+        <w:rPr>
+          <w:rFonts w:eastAsia="Calibri" w:cs="Calibri" w:ascii="Calibri" w:hAnsi="Calibri"/>
+          <w:sz w:val="21"/>
+          <w:szCs w:val="21"/>
         </w:rPr>
         <w:t>Your thread is one educational issue you can feel running through your own history — not a topic you researched, one you lived.</w:t>
       </w:r>
@@ -103,16 +127,20 @@
     <w:p>
       <w:pPr>
         <w:pStyle w:val="Heading2"/>
-        <w:rPr/>
-      </w:pPr>
-      <w:r>
-        <w:rPr>
-          <w:rFonts w:eastAsia="Calibri" w:cs="Calibri"/>
+        <w:rPr>
+          <w:rFonts w:ascii="Calibri" w:hAnsi="Calibri"/>
+          <w:sz w:val="21"/>
+          <w:szCs w:val="21"/>
+        </w:rPr>
+      </w:pPr>
+      <w:r>
+        <w:rPr>
+          <w:rFonts w:eastAsia="Calibri" w:cs="Calibri" w:ascii="Calibri" w:hAnsi="Calibri"/>
           <w:b/>
           <w:bCs/>
           <w:color w:val="4F81BD"/>
-          <w:sz w:val="26"/>
-          <w:szCs w:val="26"/>
+          <w:sz w:val="21"/>
+          <w:szCs w:val="21"/>
         </w:rPr>
         <w:t>2. What Do I Need to Do?</w:t>
       </w:r>
@@ -121,13 +149,17 @@
       <w:pPr>
         <w:pStyle w:val="normal1"/>
         <w:spacing w:lineRule="auto" w:line="276" w:before="0" w:after="200"/>
-        <w:rPr/>
-      </w:pPr>
-      <w:r>
-        <w:rPr>
-          <w:rFonts w:eastAsia="Calibri" w:cs="Calibri"/>
-          <w:sz w:val="22"/>
-          <w:szCs w:val="22"/>
+        <w:rPr>
+          <w:rFonts w:ascii="Calibri" w:hAnsi="Calibri"/>
+          <w:sz w:val="21"/>
+          <w:szCs w:val="21"/>
+        </w:rPr>
+      </w:pPr>
+      <w:r>
+        <w:rPr>
+          <w:rFonts w:eastAsia="Calibri" w:cs="Calibri" w:ascii="Calibri" w:hAnsi="Calibri"/>
+          <w:sz w:val="21"/>
+          <w:szCs w:val="21"/>
         </w:rPr>
         <w:t>You write a currere by moving through four kinds of attention, in order. All four live in Journaler’s Currere tab. The first two are timed gushes — gather the material, then build. The analytical sets those two gushes side by side, and the synthetical is an open draft with no timer.</w:t>
       </w:r>
@@ -140,23 +172,27 @@
           <w:numId w:val="1"/>
         </w:numPr>
         <w:spacing w:lineRule="auto" w:line="276" w:before="0" w:after="200"/>
-        <w:rPr/>
-      </w:pPr>
-      <w:r>
-        <w:rPr>
-          <w:rFonts w:eastAsia="Calibri" w:cs="Calibri"/>
+        <w:rPr>
+          <w:rFonts w:ascii="Calibri" w:hAnsi="Calibri"/>
+          <w:sz w:val="21"/>
+          <w:szCs w:val="21"/>
+        </w:rPr>
+      </w:pPr>
+      <w:r>
+        <w:rPr>
+          <w:rFonts w:eastAsia="Calibri" w:cs="Calibri" w:ascii="Calibri" w:hAnsi="Calibri"/>
           <w:b/>
           <w:bCs/>
-          <w:sz w:val="22"/>
-          <w:szCs w:val="22"/>
+          <w:sz w:val="21"/>
+          <w:szCs w:val="21"/>
         </w:rPr>
         <w:t>Regressive — go back and gather.</w:t>
       </w:r>
       <w:r>
         <w:rPr>
-          <w:rFonts w:eastAsia="Calibri" w:cs="Calibri"/>
-          <w:sz w:val="22"/>
-          <w:szCs w:val="22"/>
+          <w:rFonts w:eastAsia="Calibri" w:cs="Calibri" w:ascii="Calibri" w:hAnsi="Calibri"/>
+          <w:sz w:val="21"/>
+          <w:szCs w:val="21"/>
         </w:rPr>
         <w:t xml:space="preserve"> Free-associate your life in schools, as far back as you can reach. No order, no editing. When the buzzer sounds, note how you feel about what came up.</w:t>
       </w:r>
@@ -169,23 +205,27 @@
           <w:numId w:val="1"/>
         </w:numPr>
         <w:spacing w:lineRule="auto" w:line="276" w:before="0" w:after="200"/>
-        <w:rPr/>
-      </w:pPr>
-      <w:r>
-        <w:rPr>
-          <w:rFonts w:eastAsia="Calibri" w:cs="Calibri"/>
+        <w:rPr>
+          <w:rFonts w:ascii="Calibri" w:hAnsi="Calibri"/>
+          <w:sz w:val="21"/>
+          <w:szCs w:val="21"/>
+        </w:rPr>
+      </w:pPr>
+      <w:r>
+        <w:rPr>
+          <w:rFonts w:eastAsia="Calibri" w:cs="Calibri" w:ascii="Calibri" w:hAnsi="Calibri"/>
           <w:b/>
           <w:bCs/>
-          <w:sz w:val="22"/>
-          <w:szCs w:val="22"/>
+          <w:sz w:val="21"/>
+          <w:szCs w:val="21"/>
         </w:rPr>
         <w:t>Progressive — go forward and gather again.</w:t>
       </w:r>
       <w:r>
         <w:rPr>
-          <w:rFonts w:eastAsia="Calibri" w:cs="Calibri"/>
-          <w:sz w:val="22"/>
-          <w:szCs w:val="22"/>
+          <w:rFonts w:eastAsia="Calibri" w:cs="Calibri" w:ascii="Calibri" w:hAnsi="Calibri"/>
+          <w:sz w:val="21"/>
+          <w:szCs w:val="21"/>
         </w:rPr>
         <w:t xml:space="preserve"> Project yourself into your future and write it down as if you were remembering it — not a wish list, but what is likely to happen, built out of the past you just gathered. Moore calls these “memories” of things that have not happened yet. He also says people find this one hard. Let it be hard.</w:t>
       </w:r>
@@ -198,23 +238,27 @@
           <w:numId w:val="1"/>
         </w:numPr>
         <w:spacing w:lineRule="auto" w:line="276" w:before="0" w:after="200"/>
-        <w:rPr/>
-      </w:pPr>
-      <w:r>
-        <w:rPr>
-          <w:rFonts w:eastAsia="Calibri" w:cs="Calibri"/>
+        <w:rPr>
+          <w:rFonts w:ascii="Calibri" w:hAnsi="Calibri"/>
+          <w:sz w:val="21"/>
+          <w:szCs w:val="21"/>
+        </w:rPr>
+      </w:pPr>
+      <w:r>
+        <w:rPr>
+          <w:rFonts w:eastAsia="Calibri" w:cs="Calibri" w:ascii="Calibri" w:hAnsi="Calibri"/>
           <w:b/>
           <w:bCs/>
-          <w:sz w:val="22"/>
-          <w:szCs w:val="22"/>
+          <w:sz w:val="21"/>
+          <w:szCs w:val="21"/>
         </w:rPr>
         <w:t>Analytical — hold past and future up against each other, and look at what is between them: now.</w:t>
       </w:r>
       <w:r>
         <w:rPr>
-          <w:rFonts w:eastAsia="Calibri" w:cs="Calibri"/>
-          <w:sz w:val="22"/>
-          <w:szCs w:val="22"/>
+          <w:rFonts w:eastAsia="Calibri" w:cs="Calibri" w:ascii="Calibri" w:hAnsi="Calibri"/>
+          <w:sz w:val="21"/>
+          <w:szCs w:val="21"/>
         </w:rPr>
         <w:t xml:space="preserve"> Read your regressive gush (the past) and your progressive gush (the future) side by side, and identify the themes and connections that run through both. Whatever runs through both is what is working on you in the present: past and future are the two walls, and the space between them is where you are standing. Moore calls it the in-between space, and examining it is what the whole method is for. Name what recurs — not what it means yet.</w:t>
       </w:r>
@@ -227,40 +271,65 @@
           <w:numId w:val="1"/>
         </w:numPr>
         <w:spacing w:lineRule="auto" w:line="276" w:before="0" w:after="200"/>
-        <w:rPr/>
-      </w:pPr>
-      <w:r>
-        <w:rPr>
-          <w:rFonts w:eastAsia="Calibri" w:cs="Calibri"/>
+        <w:rPr>
+          <w:rFonts w:ascii="Calibri" w:hAnsi="Calibri"/>
+          <w:sz w:val="21"/>
+          <w:szCs w:val="21"/>
+        </w:rPr>
+      </w:pPr>
+      <w:r>
+        <w:rPr>
+          <w:rFonts w:eastAsia="Calibri" w:cs="Calibri" w:ascii="Calibri" w:hAnsi="Calibri"/>
           <w:b/>
           <w:bCs/>
-          <w:sz w:val="22"/>
-          <w:szCs w:val="22"/>
+          <w:sz w:val="21"/>
+          <w:szCs w:val="21"/>
         </w:rPr>
         <w:t>Synthetical — hold all three at once and say what changes.</w:t>
       </w:r>
       <w:r>
         <w:rPr>
-          <w:rFonts w:eastAsia="Calibri" w:cs="Calibri"/>
-          <w:sz w:val="22"/>
-          <w:szCs w:val="22"/>
-        </w:rPr>
-        <w:t xml:space="preserve"> Put three things back together, not two: where you have been, where you are going, and the themes that connect them. Then, in your own voice, write what that self-knowledge changes about the teacher you intend to be. In this course that writing is your currere — the essay is where the synthesis happens.</w:t>
+          <w:rFonts w:eastAsia="Calibri" w:cs="Calibri" w:ascii="Calibri" w:hAnsi="Calibri"/>
+          <w:sz w:val="21"/>
+          <w:szCs w:val="21"/>
+        </w:rPr>
+        <w:t xml:space="preserve"> Put </w:t>
+      </w:r>
+      <w:r>
+        <w:rPr>
+          <w:rFonts w:eastAsia="Calibri" w:cs="Calibri" w:ascii="Calibri" w:hAnsi="Calibri"/>
+          <w:sz w:val="21"/>
+          <w:szCs w:val="21"/>
+          <w:u w:val="single"/>
+        </w:rPr>
+        <w:t>three</w:t>
+      </w:r>
+      <w:r>
+        <w:rPr>
+          <w:rFonts w:eastAsia="Calibri" w:cs="Calibri" w:ascii="Calibri" w:hAnsi="Calibri"/>
+          <w:sz w:val="21"/>
+          <w:szCs w:val="21"/>
+        </w:rPr>
+        <w:t xml:space="preserve"> things back together: where you have been, where you are going, and the themes that connect them. Then, in your own voice, write what that self-knowledge changes about the teacher you intend to be. In this course that writing is your currere — the essay is where the synthesis happens.</w:t>
       </w:r>
     </w:p>
     <w:p>
       <w:pPr>
         <w:pStyle w:val="Heading2"/>
-        <w:rPr/>
-      </w:pPr>
-      <w:r>
-        <w:rPr>
-          <w:rFonts w:eastAsia="Calibri" w:cs="Calibri"/>
+        <w:rPr>
+          <w:rFonts w:ascii="Calibri" w:hAnsi="Calibri"/>
+          <w:sz w:val="21"/>
+          <w:szCs w:val="21"/>
+        </w:rPr>
+      </w:pPr>
+      <w:r>
+        <w:rPr>
+          <w:rFonts w:eastAsia="Calibri" w:cs="Calibri" w:ascii="Calibri" w:hAnsi="Calibri"/>
           <w:b/>
           <w:bCs/>
           <w:color w:val="4F81BD"/>
-          <w:sz w:val="26"/>
-          <w:szCs w:val="26"/>
+          <w:sz w:val="21"/>
+          <w:szCs w:val="21"/>
         </w:rPr>
         <w:t>3. Length &amp; Format</w:t>
       </w:r>
@@ -269,13 +338,17 @@
       <w:pPr>
         <w:pStyle w:val="normal1"/>
         <w:spacing w:lineRule="auto" w:line="276" w:before="0" w:after="200"/>
-        <w:rPr/>
-      </w:pPr>
-      <w:r>
-        <w:rPr>
-          <w:rFonts w:eastAsia="Calibri" w:cs="Calibri"/>
-          <w:sz w:val="22"/>
-          <w:szCs w:val="22"/>
+        <w:rPr>
+          <w:rFonts w:ascii="Calibri" w:hAnsi="Calibri"/>
+          <w:sz w:val="21"/>
+          <w:szCs w:val="21"/>
+        </w:rPr>
+      </w:pPr>
+      <w:r>
+        <w:rPr>
+          <w:rFonts w:eastAsia="Calibri" w:cs="Calibri" w:ascii="Calibri" w:hAnsi="Calibri"/>
+          <w:sz w:val="21"/>
+          <w:szCs w:val="21"/>
         </w:rPr>
         <w:t>There’s no fixed length. The currere runs longer than a One-Pager — let the thread tell you how much it needs. Most of it is narrative, told with enough detail and sensation that a reader comes close to living the moment, not just understanding it. Somewhere in it, you step back to say what the thread means for your present and future.</w:t>
       </w:r>
@@ -284,13 +357,17 @@
       <w:pPr>
         <w:pStyle w:val="normal1"/>
         <w:spacing w:lineRule="auto" w:line="276" w:before="0" w:after="200"/>
-        <w:rPr/>
-      </w:pPr>
-      <w:r>
-        <w:rPr>
-          <w:rFonts w:eastAsia="Calibri" w:cs="Calibri"/>
-          <w:sz w:val="22"/>
-          <w:szCs w:val="22"/>
+        <w:rPr>
+          <w:rFonts w:ascii="Calibri" w:hAnsi="Calibri"/>
+          <w:sz w:val="21"/>
+          <w:szCs w:val="21"/>
+        </w:rPr>
+      </w:pPr>
+      <w:r>
+        <w:rPr>
+          <w:rFonts w:eastAsia="Calibri" w:cs="Calibri" w:ascii="Calibri" w:hAnsi="Calibri"/>
+          <w:sz w:val="21"/>
+          <w:szCs w:val="21"/>
         </w:rPr>
         <w:t>There’s no set shape, either. Two come up often: an open currere breaks into named parts that walk the four movements (see J. Edwards, “Beyond Presence”); a braided one runs as one piece with an interior voice, holding its meaning until it lands late (see M. T. Edwards, “Who’s Cheating Whom?”). Neither is right — let your thread decide. For endings, notice how Daspit, Romano, and Bird each land their closes.</w:t>
       </w:r>
@@ -299,13 +376,17 @@
       <w:pPr>
         <w:pStyle w:val="normal1"/>
         <w:spacing w:lineRule="auto" w:line="276" w:before="0" w:after="200"/>
-        <w:rPr/>
-      </w:pPr>
-      <w:r>
-        <w:rPr>
-          <w:rFonts w:eastAsia="Calibri" w:cs="Calibri"/>
-          <w:sz w:val="22"/>
-          <w:szCs w:val="22"/>
+        <w:rPr>
+          <w:rFonts w:ascii="Calibri" w:hAnsi="Calibri"/>
+          <w:sz w:val="21"/>
+          <w:szCs w:val="21"/>
+        </w:rPr>
+      </w:pPr>
+      <w:r>
+        <w:rPr>
+          <w:rFonts w:eastAsia="Calibri" w:cs="Calibri" w:ascii="Calibri" w:hAnsi="Calibri"/>
+          <w:sz w:val="21"/>
+          <w:szCs w:val="21"/>
         </w:rPr>
         <w:t>Submit as a single PDF, with your audio as a complete URL and your AI-use log. Due Friday, October 30.</w:t>
       </w:r>
@@ -313,16 +394,20 @@
     <w:p>
       <w:pPr>
         <w:pStyle w:val="Heading2"/>
-        <w:rPr/>
-      </w:pPr>
-      <w:r>
-        <w:rPr>
-          <w:rFonts w:eastAsia="Calibri" w:cs="Calibri"/>
+        <w:rPr>
+          <w:rFonts w:ascii="Calibri" w:hAnsi="Calibri"/>
+          <w:sz w:val="21"/>
+          <w:szCs w:val="21"/>
+        </w:rPr>
+      </w:pPr>
+      <w:r>
+        <w:rPr>
+          <w:rFonts w:eastAsia="Calibri" w:cs="Calibri" w:ascii="Calibri" w:hAnsi="Calibri"/>
           <w:b/>
           <w:bCs/>
           <w:color w:val="4F81BD"/>
-          <w:sz w:val="26"/>
-          <w:szCs w:val="26"/>
+          <w:sz w:val="21"/>
+          <w:szCs w:val="21"/>
         </w:rPr>
         <w:t>4. Working Collaboratively</w:t>
       </w:r>
@@ -331,60 +416,54 @@
       <w:pPr>
         <w:pStyle w:val="normal1"/>
         <w:spacing w:lineRule="auto" w:line="276" w:before="0" w:after="200"/>
-        <w:rPr/>
-      </w:pPr>
-      <w:r>
-        <w:rPr>
-          <w:rFonts w:eastAsia="Calibri" w:cs="Calibri"/>
-          <w:sz w:val="22"/>
-          <w:szCs w:val="22"/>
-        </w:rPr>
-        <w:t xml:space="preserve">In Act II, AI is a studio tool, not a writer. The thread is yours and cannot be faked or borrowed. Use it three honest ways: after each gush, Journaler’s </w:t>
-      </w:r>
-      <w:r>
-        <w:rPr>
-          <w:rFonts w:eastAsia="Calibri" w:cs="Calibri"/>
-          <w:sz w:val="22"/>
-          <w:szCs w:val="22"/>
-        </w:rPr>
-        <w:t xml:space="preserve">AI </w:t>
-      </w:r>
-      <w:r>
-        <w:rPr>
-          <w:rFonts w:eastAsia="Calibri" w:cs="Calibri"/>
-          <w:sz w:val="22"/>
-          <w:szCs w:val="22"/>
-        </w:rPr>
-        <w:t xml:space="preserve">reflection partner </w:t>
-      </w:r>
-      <w:r>
-        <w:rPr>
-          <w:rFonts w:eastAsia="Calibri" w:cs="Calibri"/>
-          <w:sz w:val="22"/>
-          <w:szCs w:val="22"/>
-        </w:rPr>
-        <w:t>(it answers as Romano)</w:t>
-      </w:r>
-      <w:r>
-        <w:rPr>
-          <w:rFonts w:eastAsia="Calibri" w:cs="Calibri"/>
-          <w:sz w:val="22"/>
-          <w:szCs w:val="22"/>
-        </w:rPr>
-        <w:t xml:space="preserve"> asks how the writing went — about the experience of remembering, never supplying your words; before your topic conference, Todd-in-a-Can reads your candidate threads and asks which has the most room, without choosing for you; and in revision, ask whether a scene is clear and vivid — a craft consultant, not a ghostwriter. The analytical stays yours: Journaler sets your gushes side by side and counts the threads you name, but finding what recurs is the work, so no AI does it for you.</w:t>
+        <w:rPr>
+          <w:rFonts w:ascii="Calibri" w:hAnsi="Calibri"/>
+          <w:sz w:val="21"/>
+          <w:szCs w:val="21"/>
+        </w:rPr>
+      </w:pPr>
+      <w:r>
+        <w:rPr>
+          <w:rFonts w:eastAsia="Calibri" w:cs="Calibri" w:ascii="Calibri" w:hAnsi="Calibri"/>
+          <w:sz w:val="21"/>
+          <w:szCs w:val="21"/>
+        </w:rPr>
+        <w:t xml:space="preserve">In Act II, AI is a studio tool, not a writer. The thread is yours and cannot be faked or borrowed. Use it three honest ways: after each gush, Journaler’s AI reflection partner (it answers as Romano) asks how the writing went — about the experience of remembering, never supplying your words; </w:t>
+      </w:r>
+      <w:r>
+        <w:rPr>
+          <w:rFonts w:eastAsia="Calibri" w:cs="Calibri" w:ascii="Calibri" w:hAnsi="Calibri"/>
+          <w:b/>
+          <w:bCs/>
+          <w:sz w:val="21"/>
+          <w:szCs w:val="21"/>
+        </w:rPr>
+        <w:t>before your topic conference, Todd-in-a-Can reads your candidate threads and asks which has the most room, without choosing for you; and in revision, ask whether a scene is clear and vivid — a craft consultant, not a ghostwriter.</w:t>
+      </w:r>
+      <w:r>
+        <w:rPr>
+          <w:rFonts w:eastAsia="Calibri" w:cs="Calibri" w:ascii="Calibri" w:hAnsi="Calibri"/>
+          <w:sz w:val="21"/>
+          <w:szCs w:val="21"/>
+        </w:rPr>
+        <w:t xml:space="preserve"> The analytical stays yours: Journaler sets your gushes side by side and counts the threads you name, but finding what recurs is the work, so no AI does it for you.</w:t>
       </w:r>
     </w:p>
     <w:p>
       <w:pPr>
         <w:pStyle w:val="normal1"/>
         <w:spacing w:lineRule="auto" w:line="276" w:before="0" w:after="200"/>
-        <w:rPr/>
-      </w:pPr>
-      <w:r>
-        <w:rPr>
-          <w:rFonts w:eastAsia="Calibri" w:cs="Calibri"/>
-          <w:sz w:val="22"/>
-          <w:szCs w:val="22"/>
+        <w:rPr>
+          <w:rFonts w:ascii="Calibri" w:hAnsi="Calibri"/>
+          <w:sz w:val="21"/>
+          <w:szCs w:val="21"/>
+        </w:rPr>
+      </w:pPr>
+      <w:r>
+        <w:rPr>
+          <w:rFonts w:eastAsia="Calibri" w:cs="Calibri" w:ascii="Calibri" w:hAnsi="Calibri"/>
+          <w:sz w:val="21"/>
+          <w:szCs w:val="21"/>
         </w:rPr>
         <w:t>The rule: AI helps you see your own writing. It never makes your memories or your meaning. Your AI-use log goes in with each submission.</w:t>
       </w:r>
@@ -392,25 +471,29 @@
     <w:p>
       <w:pPr>
         <w:pStyle w:val="Heading2"/>
-        <w:rPr/>
-      </w:pPr>
-      <w:r>
-        <w:rPr>
-          <w:rFonts w:eastAsia="Calibri" w:cs="Calibri"/>
+        <w:rPr>
+          <w:rFonts w:ascii="Calibri" w:hAnsi="Calibri"/>
+          <w:sz w:val="21"/>
+          <w:szCs w:val="21"/>
+        </w:rPr>
+      </w:pPr>
+      <w:r>
+        <w:rPr>
+          <w:rFonts w:eastAsia="Calibri" w:cs="Calibri" w:ascii="Calibri" w:hAnsi="Calibri"/>
           <w:b/>
           <w:bCs/>
           <w:color w:val="4F81BD"/>
-          <w:sz w:val="26"/>
-          <w:szCs w:val="26"/>
+          <w:sz w:val="21"/>
+          <w:szCs w:val="21"/>
         </w:rPr>
         <w:t>5. How Is My Work Being Assessed?</w:t>
       </w:r>
     </w:p>
     <w:tbl>
       <w:tblPr>
-        <w:tblW w:w="10800" w:type="dxa"/>
+        <w:tblW w:w="10625" w:type="dxa"/>
         <w:jc w:val="left"/>
-        <w:tblInd w:w="0" w:type="dxa"/>
+        <w:tblInd w:w="175" w:type="dxa"/>
         <w:tblLayout w:type="fixed"/>
         <w:tblCellMar>
           <w:top w:w="100" w:type="dxa"/>
@@ -421,14 +504,49 @@
         <w:tblLook w:noVBand="1" w:firstColumn="1" w:firstRow="1"/>
       </w:tblPr>
       <w:tblGrid>
-        <w:gridCol w:w="2340"/>
-        <w:gridCol w:w="8459"/>
+        <w:gridCol w:w="2160"/>
+        <w:gridCol w:w="8465"/>
       </w:tblGrid>
       <w:tr>
         <w:trPr/>
         <w:tc>
           <w:tcPr>
-            <w:tcW w:w="2340" w:type="dxa"/>
+            <w:tcW w:w="2160" w:type="dxa"/>
+            <w:tcBorders>
+              <w:top w:val="single" w:sz="4" w:space="0" w:color="000000"/>
+              <w:left w:val="single" w:sz="4" w:space="0" w:color="000000"/>
+              <w:bottom w:val="single" w:sz="4" w:space="0" w:color="000000"/>
+              <w:right w:val="single" w:sz="4" w:space="0" w:color="000000"/>
+            </w:tcBorders>
+            <w:shd w:fill="DDDDDD" w:val="clear"/>
+          </w:tcPr>
+          <w:p>
+            <w:pPr>
+              <w:pStyle w:val="normal1"/>
+              <w:spacing w:lineRule="auto" w:line="276" w:before="0" w:after="200"/>
+              <w:rPr>
+                <w:rFonts w:ascii="Calibri" w:hAnsi="Calibri"/>
+                <w:color w:val="000000"/>
+                <w:sz w:val="21"/>
+                <w:szCs w:val="21"/>
+              </w:rPr>
+            </w:pPr>
+            <w:r>
+              <w:rPr>
+                <w:rFonts w:eastAsia="Calibri" w:cs="Calibri" w:ascii="Calibri" w:hAnsi="Calibri"/>
+                <w:b/>
+                <w:bCs/>
+                <w:color w:val="000000"/>
+                <w:sz w:val="21"/>
+                <w:szCs w:val="21"/>
+              </w:rPr>
+              <w:t>Cover Page (5)</w:t>
+            </w:r>
+          </w:p>
+        </w:tc>
+        <w:tc>
+          <w:tcPr>
+            <w:tcW w:w="8465" w:type="dxa"/>
             <w:tcBorders>
               <w:top w:val="single" w:sz="4" w:space="0" w:color="000000"/>
               <w:left w:val="single" w:sz="4" w:space="0" w:color="000000"/>
@@ -440,23 +558,63 @@
             <w:pPr>
               <w:pStyle w:val="normal1"/>
               <w:spacing w:lineRule="auto" w:line="276" w:before="0" w:after="200"/>
-              <w:rPr/>
-            </w:pPr>
-            <w:r>
-              <w:rPr>
-                <w:rFonts w:eastAsia="Calibri" w:cs="Calibri"/>
+              <w:rPr>
+                <w:rFonts w:ascii="Calibri" w:hAnsi="Calibri"/>
+                <w:sz w:val="21"/>
+                <w:szCs w:val="21"/>
+              </w:rPr>
+            </w:pPr>
+            <w:r>
+              <w:rPr>
+                <w:rFonts w:eastAsia="Calibri" w:cs="Calibri" w:ascii="Calibri" w:hAnsi="Calibri"/>
+                <w:sz w:val="21"/>
+                <w:szCs w:val="21"/>
+              </w:rPr>
+              <w:t>Identify SPECIFIC revisions you made along with discussion of SPECIFIC passages from Write What Matters and SPECIFIC feedback from classmates that informed your revisions.</w:t>
+            </w:r>
+          </w:p>
+        </w:tc>
+      </w:tr>
+      <w:tr>
+        <w:trPr/>
+        <w:tc>
+          <w:tcPr>
+            <w:tcW w:w="2160" w:type="dxa"/>
+            <w:tcBorders>
+              <w:top w:val="single" w:sz="4" w:space="0" w:color="000000"/>
+              <w:left w:val="single" w:sz="4" w:space="0" w:color="000000"/>
+              <w:bottom w:val="single" w:sz="4" w:space="0" w:color="000000"/>
+              <w:right w:val="single" w:sz="4" w:space="0" w:color="000000"/>
+            </w:tcBorders>
+            <w:shd w:fill="DDDDDD" w:val="clear"/>
+          </w:tcPr>
+          <w:p>
+            <w:pPr>
+              <w:pStyle w:val="normal1"/>
+              <w:spacing w:lineRule="auto" w:line="276" w:before="0" w:after="200"/>
+              <w:rPr>
+                <w:rFonts w:ascii="Calibri" w:hAnsi="Calibri"/>
+                <w:color w:val="000000"/>
+                <w:sz w:val="21"/>
+                <w:szCs w:val="21"/>
+              </w:rPr>
+            </w:pPr>
+            <w:r>
+              <w:rPr>
+                <w:rFonts w:eastAsia="Calibri" w:cs="Calibri" w:ascii="Calibri" w:hAnsi="Calibri"/>
                 <w:b/>
                 <w:bCs/>
-                <w:sz w:val="22"/>
-                <w:szCs w:val="22"/>
-              </w:rPr>
-              <w:t>Cover Page (5)</w:t>
+                <w:color w:val="000000"/>
+                <w:sz w:val="21"/>
+                <w:szCs w:val="21"/>
+              </w:rPr>
+              <w:t>Essay Content (5)</w:t>
             </w:r>
           </w:p>
         </w:tc>
         <w:tc>
           <w:tcPr>
-            <w:tcW w:w="8459" w:type="dxa"/>
+            <w:tcW w:w="8465" w:type="dxa"/>
             <w:tcBorders>
               <w:top w:val="single" w:sz="4" w:space="0" w:color="000000"/>
               <w:left w:val="single" w:sz="4" w:space="0" w:color="000000"/>
@@ -468,15 +626,19 @@
             <w:pPr>
               <w:pStyle w:val="normal1"/>
               <w:spacing w:lineRule="auto" w:line="276" w:before="0" w:after="200"/>
-              <w:rPr/>
-            </w:pPr>
-            <w:r>
-              <w:rPr>
-                <w:rFonts w:eastAsia="Calibri" w:cs="Calibri"/>
-                <w:sz w:val="22"/>
-                <w:szCs w:val="22"/>
-              </w:rPr>
-              <w:t>Identify SPECIFIC revisions you made along with discussion of SPECIFIC passages from Write What Matters and SPECIFIC feedback from classmates that informed your revisions.</w:t>
+              <w:rPr>
+                <w:rFonts w:ascii="Calibri" w:hAnsi="Calibri"/>
+                <w:sz w:val="21"/>
+                <w:szCs w:val="21"/>
+              </w:rPr>
+            </w:pPr>
+            <w:r>
+              <w:rPr>
+                <w:rFonts w:eastAsia="Calibri" w:cs="Calibri" w:ascii="Calibri" w:hAnsi="Calibri"/>
+                <w:sz w:val="21"/>
+                <w:szCs w:val="21"/>
+              </w:rPr>
+              <w:t>You trace one important thread across your life, in scenes with the potential to give readers new insight.</w:t>
             </w:r>
           </w:p>
         </w:tc>
@@ -485,7 +647,53 @@
         <w:trPr/>
         <w:tc>
           <w:tcPr>
-            <w:tcW w:w="2340" w:type="dxa"/>
+            <w:tcW w:w="2160" w:type="dxa"/>
+            <w:tcBorders>
+              <w:top w:val="single" w:sz="4" w:space="0" w:color="000000"/>
+              <w:left w:val="single" w:sz="4" w:space="0" w:color="000000"/>
+              <w:bottom w:val="single" w:sz="4" w:space="0" w:color="000000"/>
+              <w:right w:val="single" w:sz="4" w:space="0" w:color="000000"/>
+            </w:tcBorders>
+            <w:shd w:fill="DDDDDD" w:val="clear"/>
+          </w:tcPr>
+          <w:p>
+            <w:pPr>
+              <w:pStyle w:val="normal1"/>
+              <w:spacing w:lineRule="auto" w:line="276" w:before="0" w:after="200"/>
+              <w:rPr>
+                <w:rFonts w:ascii="Calibri" w:hAnsi="Calibri"/>
+                <w:color w:val="000000"/>
+                <w:sz w:val="21"/>
+                <w:szCs w:val="21"/>
+              </w:rPr>
+            </w:pPr>
+            <w:r>
+              <w:rPr>
+                <w:rFonts w:eastAsia="Calibri" w:cs="Calibri" w:ascii="Calibri" w:hAnsi="Calibri"/>
+                <w:b/>
+                <w:bCs/>
+                <w:color w:val="000000"/>
+                <w:sz w:val="21"/>
+                <w:szCs w:val="21"/>
+              </w:rPr>
+              <w:t>“</w:t>
+            </w:r>
+            <w:r>
+              <w:rPr>
+                <w:rFonts w:eastAsia="Calibri" w:cs="Calibri" w:ascii="Calibri" w:hAnsi="Calibri"/>
+                <w:b/>
+                <w:bCs/>
+                <w:color w:val="000000"/>
+                <w:sz w:val="21"/>
+                <w:szCs w:val="21"/>
+              </w:rPr>
+              <w:t>Show, not tell” (5)</w:t>
+            </w:r>
+          </w:p>
+        </w:tc>
+        <w:tc>
+          <w:tcPr>
+            <w:tcW w:w="8465" w:type="dxa"/>
             <w:tcBorders>
               <w:top w:val="single" w:sz="4" w:space="0" w:color="000000"/>
               <w:left w:val="single" w:sz="4" w:space="0" w:color="000000"/>
@@ -497,23 +705,63 @@
             <w:pPr>
               <w:pStyle w:val="normal1"/>
               <w:spacing w:lineRule="auto" w:line="276" w:before="0" w:after="200"/>
-              <w:rPr/>
-            </w:pPr>
-            <w:r>
-              <w:rPr>
-                <w:rFonts w:eastAsia="Calibri" w:cs="Calibri"/>
+              <w:rPr>
+                <w:rFonts w:ascii="Calibri" w:hAnsi="Calibri"/>
+                <w:sz w:val="21"/>
+                <w:szCs w:val="21"/>
+              </w:rPr>
+            </w:pPr>
+            <w:r>
+              <w:rPr>
+                <w:rFonts w:eastAsia="Calibri" w:cs="Calibri" w:ascii="Calibri" w:hAnsi="Calibri"/>
+                <w:sz w:val="21"/>
+                <w:szCs w:val="21"/>
+              </w:rPr>
+              <w:t>The narrative portions of the essay “show” the reader specific moments. Rather than summarizing moments, you place the reader in the event.</w:t>
+            </w:r>
+          </w:p>
+        </w:tc>
+      </w:tr>
+      <w:tr>
+        <w:trPr/>
+        <w:tc>
+          <w:tcPr>
+            <w:tcW w:w="2160" w:type="dxa"/>
+            <w:tcBorders>
+              <w:top w:val="single" w:sz="4" w:space="0" w:color="000000"/>
+              <w:left w:val="single" w:sz="4" w:space="0" w:color="000000"/>
+              <w:bottom w:val="single" w:sz="4" w:space="0" w:color="000000"/>
+              <w:right w:val="single" w:sz="4" w:space="0" w:color="000000"/>
+            </w:tcBorders>
+            <w:shd w:fill="DDDDDD" w:val="clear"/>
+          </w:tcPr>
+          <w:p>
+            <w:pPr>
+              <w:pStyle w:val="normal1"/>
+              <w:spacing w:lineRule="auto" w:line="276" w:before="0" w:after="200"/>
+              <w:rPr>
+                <w:rFonts w:ascii="Calibri" w:hAnsi="Calibri"/>
+                <w:color w:val="000000"/>
+                <w:sz w:val="21"/>
+                <w:szCs w:val="21"/>
+              </w:rPr>
+            </w:pPr>
+            <w:r>
+              <w:rPr>
+                <w:rFonts w:eastAsia="Calibri" w:cs="Calibri" w:ascii="Calibri" w:hAnsi="Calibri"/>
                 <w:b/>
                 <w:bCs/>
-                <w:sz w:val="22"/>
-                <w:szCs w:val="22"/>
-              </w:rPr>
-              <w:t>Essay Content (5)</w:t>
+                <w:color w:val="000000"/>
+                <w:sz w:val="21"/>
+                <w:szCs w:val="21"/>
+              </w:rPr>
+              <w:t>Looking at the Now (5)</w:t>
             </w:r>
           </w:p>
         </w:tc>
         <w:tc>
           <w:tcPr>
-            <w:tcW w:w="8459" w:type="dxa"/>
+            <w:tcW w:w="8465" w:type="dxa"/>
             <w:tcBorders>
               <w:top w:val="single" w:sz="4" w:space="0" w:color="000000"/>
               <w:left w:val="single" w:sz="4" w:space="0" w:color="000000"/>
@@ -525,15 +773,19 @@
             <w:pPr>
               <w:pStyle w:val="normal1"/>
               <w:spacing w:lineRule="auto" w:line="276" w:before="0" w:after="200"/>
-              <w:rPr/>
-            </w:pPr>
-            <w:r>
-              <w:rPr>
-                <w:rFonts w:eastAsia="Calibri" w:cs="Calibri"/>
-                <w:sz w:val="22"/>
-                <w:szCs w:val="22"/>
-              </w:rPr>
-              <w:t>You trace one important thread across your life, in scenes with the potential to give readers new insight.</w:t>
+              <w:rPr>
+                <w:rFonts w:ascii="Calibri" w:hAnsi="Calibri"/>
+                <w:sz w:val="21"/>
+                <w:szCs w:val="21"/>
+              </w:rPr>
+            </w:pPr>
+            <w:r>
+              <w:rPr>
+                <w:rFonts w:eastAsia="Calibri" w:cs="Calibri" w:ascii="Calibri" w:hAnsi="Calibri"/>
+                <w:sz w:val="21"/>
+                <w:szCs w:val="21"/>
+              </w:rPr>
+              <w:t>Implications of the event are discussed in terms of the present in one or more thoughtfully analyzed segments of the essay.</w:t>
             </w:r>
           </w:p>
         </w:tc>
@@ -542,7 +794,42 @@
         <w:trPr/>
         <w:tc>
           <w:tcPr>
-            <w:tcW w:w="2340" w:type="dxa"/>
+            <w:tcW w:w="2160" w:type="dxa"/>
+            <w:tcBorders>
+              <w:top w:val="single" w:sz="4" w:space="0" w:color="000000"/>
+              <w:left w:val="single" w:sz="4" w:space="0" w:color="000000"/>
+              <w:bottom w:val="single" w:sz="4" w:space="0" w:color="000000"/>
+              <w:right w:val="single" w:sz="4" w:space="0" w:color="000000"/>
+            </w:tcBorders>
+            <w:shd w:fill="DDDDDD" w:val="clear"/>
+          </w:tcPr>
+          <w:p>
+            <w:pPr>
+              <w:pStyle w:val="normal1"/>
+              <w:spacing w:lineRule="auto" w:line="276" w:before="0" w:after="200"/>
+              <w:rPr>
+                <w:rFonts w:ascii="Calibri" w:hAnsi="Calibri"/>
+                <w:color w:val="000000"/>
+                <w:sz w:val="21"/>
+                <w:szCs w:val="21"/>
+              </w:rPr>
+            </w:pPr>
+            <w:r>
+              <w:rPr>
+                <w:rFonts w:eastAsia="Calibri" w:cs="Calibri" w:ascii="Calibri" w:hAnsi="Calibri"/>
+                <w:b/>
+                <w:bCs/>
+                <w:color w:val="000000"/>
+                <w:sz w:val="21"/>
+                <w:szCs w:val="21"/>
+              </w:rPr>
+              <w:t>Looking Forward (5)</w:t>
+            </w:r>
+          </w:p>
+        </w:tc>
+        <w:tc>
+          <w:tcPr>
+            <w:tcW w:w="8465" w:type="dxa"/>
             <w:tcBorders>
               <w:top w:val="single" w:sz="4" w:space="0" w:color="000000"/>
               <w:left w:val="single" w:sz="4" w:space="0" w:color="000000"/>
@@ -554,33 +841,63 @@
             <w:pPr>
               <w:pStyle w:val="normal1"/>
               <w:spacing w:lineRule="auto" w:line="276" w:before="0" w:after="200"/>
-              <w:rPr/>
-            </w:pPr>
-            <w:r>
-              <w:rPr>
-                <w:rFonts w:eastAsia="Calibri" w:cs="Calibri"/>
+              <w:rPr>
+                <w:rFonts w:ascii="Calibri" w:hAnsi="Calibri"/>
+                <w:sz w:val="21"/>
+                <w:szCs w:val="21"/>
+              </w:rPr>
+            </w:pPr>
+            <w:r>
+              <w:rPr>
+                <w:rFonts w:eastAsia="Calibri" w:cs="Calibri" w:ascii="Calibri" w:hAnsi="Calibri"/>
+                <w:sz w:val="21"/>
+                <w:szCs w:val="21"/>
+              </w:rPr>
+              <w:t>Implications of the event are discussed in terms of the future in one or more thoughtfully analyzed segments of the essay.</w:t>
+            </w:r>
+          </w:p>
+        </w:tc>
+      </w:tr>
+      <w:tr>
+        <w:trPr/>
+        <w:tc>
+          <w:tcPr>
+            <w:tcW w:w="2160" w:type="dxa"/>
+            <w:tcBorders>
+              <w:top w:val="single" w:sz="4" w:space="0" w:color="000000"/>
+              <w:left w:val="single" w:sz="4" w:space="0" w:color="000000"/>
+              <w:bottom w:val="single" w:sz="4" w:space="0" w:color="000000"/>
+              <w:right w:val="single" w:sz="4" w:space="0" w:color="000000"/>
+            </w:tcBorders>
+            <w:shd w:fill="DDDDDD" w:val="clear"/>
+          </w:tcPr>
+          <w:p>
+            <w:pPr>
+              <w:pStyle w:val="normal1"/>
+              <w:spacing w:lineRule="auto" w:line="276" w:before="0" w:after="200"/>
+              <w:rPr>
+                <w:rFonts w:ascii="Calibri" w:hAnsi="Calibri"/>
+                <w:color w:val="000000"/>
+                <w:sz w:val="21"/>
+                <w:szCs w:val="21"/>
+              </w:rPr>
+            </w:pPr>
+            <w:r>
+              <w:rPr>
+                <w:rFonts w:eastAsia="Calibri" w:cs="Calibri" w:ascii="Calibri" w:hAnsi="Calibri"/>
                 <w:b/>
                 <w:bCs/>
-                <w:sz w:val="22"/>
-                <w:szCs w:val="22"/>
-              </w:rPr>
-              <w:t>“</w:t>
-            </w:r>
-            <w:r>
-              <w:rPr>
-                <w:rFonts w:eastAsia="Calibri" w:cs="Calibri"/>
-                <w:b/>
-                <w:bCs/>
-                <w:sz w:val="22"/>
-                <w:szCs w:val="22"/>
-              </w:rPr>
-              <w:t>Show, not tell” (5)</w:t>
+                <w:color w:val="000000"/>
+                <w:sz w:val="21"/>
+                <w:szCs w:val="21"/>
+              </w:rPr>
+              <w:t>Audio Reading (5)</w:t>
             </w:r>
           </w:p>
         </w:tc>
         <w:tc>
           <w:tcPr>
-            <w:tcW w:w="8459" w:type="dxa"/>
+            <w:tcW w:w="8465" w:type="dxa"/>
             <w:tcBorders>
               <w:top w:val="single" w:sz="4" w:space="0" w:color="000000"/>
               <w:left w:val="single" w:sz="4" w:space="0" w:color="000000"/>
@@ -592,184 +909,17 @@
             <w:pPr>
               <w:pStyle w:val="normal1"/>
               <w:spacing w:lineRule="auto" w:line="276" w:before="0" w:after="200"/>
-              <w:rPr/>
-            </w:pPr>
-            <w:r>
-              <w:rPr>
-                <w:rFonts w:eastAsia="Calibri" w:cs="Calibri"/>
-                <w:sz w:val="22"/>
-                <w:szCs w:val="22"/>
-              </w:rPr>
-              <w:t>The narrative portions of the essay “show” the reader specific moments. Rather than summarizing moments, you place the reader in the event.</w:t>
-            </w:r>
-          </w:p>
-        </w:tc>
-      </w:tr>
-      <w:tr>
-        <w:trPr/>
-        <w:tc>
-          <w:tcPr>
-            <w:tcW w:w="2340" w:type="dxa"/>
-            <w:tcBorders>
-              <w:top w:val="single" w:sz="4" w:space="0" w:color="000000"/>
-              <w:left w:val="single" w:sz="4" w:space="0" w:color="000000"/>
-              <w:bottom w:val="single" w:sz="4" w:space="0" w:color="000000"/>
-              <w:right w:val="single" w:sz="4" w:space="0" w:color="000000"/>
-            </w:tcBorders>
-          </w:tcPr>
-          <w:p>
-            <w:pPr>
-              <w:pStyle w:val="normal1"/>
-              <w:spacing w:lineRule="auto" w:line="276" w:before="0" w:after="200"/>
-              <w:rPr/>
-            </w:pPr>
-            <w:r>
-              <w:rPr>
-                <w:rFonts w:eastAsia="Calibri" w:cs="Calibri"/>
-                <w:b/>
-                <w:bCs/>
-                <w:sz w:val="22"/>
-                <w:szCs w:val="22"/>
-              </w:rPr>
-              <w:t>Looking at the Now (5)</w:t>
-            </w:r>
-          </w:p>
-        </w:tc>
-        <w:tc>
-          <w:tcPr>
-            <w:tcW w:w="8459" w:type="dxa"/>
-            <w:tcBorders>
-              <w:top w:val="single" w:sz="4" w:space="0" w:color="000000"/>
-              <w:left w:val="single" w:sz="4" w:space="0" w:color="000000"/>
-              <w:bottom w:val="single" w:sz="4" w:space="0" w:color="000000"/>
-              <w:right w:val="single" w:sz="4" w:space="0" w:color="000000"/>
-            </w:tcBorders>
-          </w:tcPr>
-          <w:p>
-            <w:pPr>
-              <w:pStyle w:val="normal1"/>
-              <w:spacing w:lineRule="auto" w:line="276" w:before="0" w:after="200"/>
-              <w:rPr/>
-            </w:pPr>
-            <w:r>
-              <w:rPr>
-                <w:rFonts w:eastAsia="Calibri" w:cs="Calibri"/>
-                <w:sz w:val="22"/>
-                <w:szCs w:val="22"/>
-              </w:rPr>
-              <w:t>Implications of the event are discussed in terms of the present in one or more thoughtfully analyzed segments of the essay.</w:t>
-            </w:r>
-          </w:p>
-        </w:tc>
-      </w:tr>
-      <w:tr>
-        <w:trPr/>
-        <w:tc>
-          <w:tcPr>
-            <w:tcW w:w="2340" w:type="dxa"/>
-            <w:tcBorders>
-              <w:top w:val="single" w:sz="4" w:space="0" w:color="000000"/>
-              <w:left w:val="single" w:sz="4" w:space="0" w:color="000000"/>
-              <w:bottom w:val="single" w:sz="4" w:space="0" w:color="000000"/>
-              <w:right w:val="single" w:sz="4" w:space="0" w:color="000000"/>
-            </w:tcBorders>
-          </w:tcPr>
-          <w:p>
-            <w:pPr>
-              <w:pStyle w:val="normal1"/>
-              <w:spacing w:lineRule="auto" w:line="276" w:before="0" w:after="200"/>
-              <w:rPr/>
-            </w:pPr>
-            <w:r>
-              <w:rPr>
-                <w:rFonts w:eastAsia="Calibri" w:cs="Calibri"/>
-                <w:b/>
-                <w:bCs/>
-                <w:sz w:val="22"/>
-                <w:szCs w:val="22"/>
-              </w:rPr>
-              <w:t>Looking Forward (5)</w:t>
-            </w:r>
-          </w:p>
-        </w:tc>
-        <w:tc>
-          <w:tcPr>
-            <w:tcW w:w="8459" w:type="dxa"/>
-            <w:tcBorders>
-              <w:top w:val="single" w:sz="4" w:space="0" w:color="000000"/>
-              <w:left w:val="single" w:sz="4" w:space="0" w:color="000000"/>
-              <w:bottom w:val="single" w:sz="4" w:space="0" w:color="000000"/>
-              <w:right w:val="single" w:sz="4" w:space="0" w:color="000000"/>
-            </w:tcBorders>
-          </w:tcPr>
-          <w:p>
-            <w:pPr>
-              <w:pStyle w:val="normal1"/>
-              <w:spacing w:lineRule="auto" w:line="276" w:before="0" w:after="200"/>
-              <w:rPr/>
-            </w:pPr>
-            <w:r>
-              <w:rPr>
-                <w:rFonts w:eastAsia="Calibri" w:cs="Calibri"/>
-                <w:sz w:val="22"/>
-                <w:szCs w:val="22"/>
-              </w:rPr>
-              <w:t>Implications of the event are discussed in terms of the future in one or more thoughtfully analyzed segments of the essay.</w:t>
-            </w:r>
-          </w:p>
-        </w:tc>
-      </w:tr>
-      <w:tr>
-        <w:trPr/>
-        <w:tc>
-          <w:tcPr>
-            <w:tcW w:w="2340" w:type="dxa"/>
-            <w:tcBorders>
-              <w:top w:val="single" w:sz="4" w:space="0" w:color="000000"/>
-              <w:left w:val="single" w:sz="4" w:space="0" w:color="000000"/>
-              <w:bottom w:val="single" w:sz="4" w:space="0" w:color="000000"/>
-              <w:right w:val="single" w:sz="4" w:space="0" w:color="000000"/>
-            </w:tcBorders>
-          </w:tcPr>
-          <w:p>
-            <w:pPr>
-              <w:pStyle w:val="normal1"/>
-              <w:spacing w:lineRule="auto" w:line="276" w:before="0" w:after="200"/>
-              <w:rPr/>
-            </w:pPr>
-            <w:r>
-              <w:rPr>
-                <w:rFonts w:eastAsia="Calibri" w:cs="Calibri"/>
-                <w:b/>
-                <w:bCs/>
-                <w:sz w:val="22"/>
-                <w:szCs w:val="22"/>
-              </w:rPr>
-              <w:t>Audio Reading (5)</w:t>
-            </w:r>
-          </w:p>
-        </w:tc>
-        <w:tc>
-          <w:tcPr>
-            <w:tcW w:w="8459" w:type="dxa"/>
-            <w:tcBorders>
-              <w:top w:val="single" w:sz="4" w:space="0" w:color="000000"/>
-              <w:left w:val="single" w:sz="4" w:space="0" w:color="000000"/>
-              <w:bottom w:val="single" w:sz="4" w:space="0" w:color="000000"/>
-              <w:right w:val="single" w:sz="4" w:space="0" w:color="000000"/>
-            </w:tcBorders>
-          </w:tcPr>
-          <w:p>
-            <w:pPr>
-              <w:pStyle w:val="normal1"/>
-              <w:spacing w:lineRule="auto" w:line="276" w:before="0" w:after="200"/>
-              <w:rPr/>
-            </w:pPr>
-            <w:r>
-              <w:rPr>
-                <w:rFonts w:eastAsia="Calibri" w:cs="Calibri"/>
-                <w:sz w:val="22"/>
-                <w:szCs w:val="22"/>
+              <w:rPr>
+                <w:rFonts w:ascii="Calibri" w:hAnsi="Calibri"/>
+                <w:sz w:val="21"/>
+                <w:szCs w:val="21"/>
+              </w:rPr>
+            </w:pPr>
+            <w:r>
+              <w:rPr>
+                <w:rFonts w:eastAsia="Calibri" w:cs="Calibri" w:ascii="Calibri" w:hAnsi="Calibri"/>
+                <w:sz w:val="21"/>
+                <w:szCs w:val="21"/>
               </w:rPr>
               <w:t>Your voice captures the impact of the event through the power of your own voice.</w:t>
             </w:r>
@@ -780,34 +930,46 @@
     <w:p>
       <w:pPr>
         <w:pStyle w:val="normal1"/>
-        <w:rPr/>
-      </w:pPr>
-      <w:r>
-        <w:rPr/>
+        <w:rPr>
+          <w:rFonts w:ascii="Calibri" w:hAnsi="Calibri"/>
+          <w:sz w:val="21"/>
+          <w:szCs w:val="21"/>
+        </w:rPr>
+      </w:pPr>
+      <w:r>
+        <w:rPr>
+          <w:rFonts w:ascii="Calibri" w:hAnsi="Calibri"/>
+          <w:sz w:val="21"/>
+          <w:szCs w:val="21"/>
+        </w:rPr>
       </w:r>
     </w:p>
     <w:p>
       <w:pPr>
         <w:pStyle w:val="normal1"/>
         <w:spacing w:lineRule="auto" w:line="276" w:before="0" w:after="200"/>
-        <w:rPr/>
-      </w:pPr>
-      <w:r>
-        <w:rPr>
-          <w:rFonts w:eastAsia="Calibri" w:cs="Calibri"/>
+        <w:rPr>
+          <w:rFonts w:ascii="Calibri" w:hAnsi="Calibri"/>
+          <w:sz w:val="21"/>
+          <w:szCs w:val="21"/>
+        </w:rPr>
+      </w:pPr>
+      <w:r>
+        <w:rPr>
+          <w:rFonts w:eastAsia="Calibri" w:cs="Calibri" w:ascii="Calibri" w:hAnsi="Calibri"/>
           <w:b/>
           <w:bCs/>
-          <w:sz w:val="22"/>
-          <w:szCs w:val="22"/>
+          <w:sz w:val="21"/>
+          <w:szCs w:val="21"/>
         </w:rPr>
         <w:t>Todd-in-a-Can prompt for your final draft — use it when you revise, later. (Choosing a thread? That prompt is at the end of the Conference Packet.)</w:t>
       </w:r>
     </w:p>
     <w:tbl>
       <w:tblPr>
-        <w:tblW w:w="10800" w:type="dxa"/>
+        <w:tblW w:w="10655" w:type="dxa"/>
         <w:jc w:val="left"/>
-        <w:tblInd w:w="0" w:type="dxa"/>
+        <w:tblInd w:w="145" w:type="dxa"/>
         <w:tblLayout w:type="fixed"/>
         <w:tblCellMar>
           <w:top w:w="100" w:type="dxa"/>
@@ -818,13 +980,13 @@
         <w:tblLook w:noVBand="1" w:firstColumn="1" w:firstRow="1"/>
       </w:tblPr>
       <w:tblGrid>
-        <w:gridCol w:w="10800"/>
+        <w:gridCol w:w="10655"/>
       </w:tblGrid>
       <w:tr>
         <w:trPr/>
         <w:tc>
           <w:tcPr>
-            <w:tcW w:w="10800" w:type="dxa"/>
+            <w:tcW w:w="10655" w:type="dxa"/>
             <w:tcBorders>
               <w:top w:val="single" w:sz="4" w:space="0" w:color="000000"/>
               <w:left w:val="single" w:sz="4" w:space="0" w:color="000000"/>
@@ -837,13 +999,17 @@
             <w:pPr>
               <w:pStyle w:val="normal1"/>
               <w:spacing w:lineRule="auto" w:line="276" w:before="0" w:after="200"/>
-              <w:rPr/>
-            </w:pPr>
-            <w:r>
-              <w:rPr>
-                <w:rFonts w:cs="Courier New" w:ascii="Courier New" w:hAnsi="Courier New"/>
-                <w:sz w:val="22"/>
-                <w:szCs w:val="22"/>
+              <w:rPr>
+                <w:rFonts w:ascii="Calibri" w:hAnsi="Calibri"/>
+                <w:sz w:val="21"/>
+                <w:szCs w:val="21"/>
+              </w:rPr>
+            </w:pPr>
+            <w:r>
+              <w:rPr>
+                <w:rFonts w:cs="Courier New" w:ascii="Calibri" w:hAnsi="Calibri"/>
+                <w:sz w:val="21"/>
+                <w:szCs w:val="21"/>
               </w:rPr>
               <w:t>You are Todd-in-a-Can, an AI writing coach in the voice of Todd Edwards, who teaches this course. A student is revising their currere toward the final draft: one thread of their life across a real past, a present, and an imagined future, made into one honest piece. They have already drafted it, heard it aloud, and talked it over in conference.</w:t>
             </w:r>
@@ -852,13 +1018,17 @@
             <w:pPr>
               <w:pStyle w:val="normal1"/>
               <w:spacing w:lineRule="auto" w:line="276" w:before="0" w:after="200"/>
-              <w:rPr/>
-            </w:pPr>
-            <w:r>
-              <w:rPr>
-                <w:rFonts w:cs="Courier New" w:ascii="Courier New" w:hAnsi="Courier New"/>
-                <w:sz w:val="22"/>
-                <w:szCs w:val="22"/>
+              <w:rPr>
+                <w:rFonts w:ascii="Calibri" w:hAnsi="Calibri"/>
+                <w:sz w:val="21"/>
+                <w:szCs w:val="21"/>
+              </w:rPr>
+            </w:pPr>
+            <w:r>
+              <w:rPr>
+                <w:rFonts w:cs="Courier New" w:ascii="Calibri" w:hAnsi="Calibri"/>
+                <w:sz w:val="21"/>
+                <w:szCs w:val="21"/>
               </w:rPr>
               <w:t>Your job is to help the student see their draft one more time, closely, before it is final. You do not rewrite it. You never add a scene, a sentence, or a meaning. You ask questions and tell them what you notice.</w:t>
             </w:r>
@@ -867,13 +1037,17 @@
             <w:pPr>
               <w:pStyle w:val="normal1"/>
               <w:spacing w:lineRule="auto" w:line="276" w:before="0" w:after="200"/>
-              <w:rPr/>
-            </w:pPr>
-            <w:r>
-              <w:rPr>
-                <w:rFonts w:cs="Courier New" w:ascii="Courier New" w:hAnsi="Courier New"/>
-                <w:sz w:val="22"/>
-                <w:szCs w:val="22"/>
+              <w:rPr>
+                <w:rFonts w:ascii="Calibri" w:hAnsi="Calibri"/>
+                <w:sz w:val="21"/>
+                <w:szCs w:val="21"/>
+              </w:rPr>
+            </w:pPr>
+            <w:r>
+              <w:rPr>
+                <w:rFonts w:cs="Courier New" w:ascii="Calibri" w:hAnsi="Calibri"/>
+                <w:sz w:val="21"/>
+                <w:szCs w:val="21"/>
               </w:rPr>
               <w:t>The student will paste their draft. Read it, then look for:</w:t>
             </w:r>
@@ -882,13 +1056,17 @@
             <w:pPr>
               <w:pStyle w:val="normal1"/>
               <w:spacing w:lineRule="auto" w:line="276" w:before="0" w:after="200"/>
-              <w:rPr/>
-            </w:pPr>
-            <w:r>
-              <w:rPr>
-                <w:rFonts w:cs="Courier New" w:ascii="Courier New" w:hAnsi="Courier New"/>
-                <w:sz w:val="22"/>
-                <w:szCs w:val="22"/>
+              <w:rPr>
+                <w:rFonts w:ascii="Calibri" w:hAnsi="Calibri"/>
+                <w:sz w:val="21"/>
+                <w:szCs w:val="21"/>
+              </w:rPr>
+            </w:pPr>
+            <w:r>
+              <w:rPr>
+                <w:rFonts w:cs="Courier New" w:ascii="Calibri" w:hAnsi="Calibri"/>
+                <w:sz w:val="21"/>
+                <w:szCs w:val="21"/>
               </w:rPr>
               <w:t>- Show over tell. Find the places that still summarize or name a feeling instead of putting the reader in the moment. Point to the strongest showing, too.</w:t>
             </w:r>
@@ -897,13 +1075,17 @@
             <w:pPr>
               <w:pStyle w:val="normal1"/>
               <w:spacing w:lineRule="auto" w:line="276" w:before="0" w:after="200"/>
-              <w:rPr/>
-            </w:pPr>
-            <w:r>
-              <w:rPr>
-                <w:rFonts w:cs="Courier New" w:ascii="Courier New" w:hAnsi="Courier New"/>
-                <w:sz w:val="22"/>
-                <w:szCs w:val="22"/>
+              <w:rPr>
+                <w:rFonts w:ascii="Calibri" w:hAnsi="Calibri"/>
+                <w:sz w:val="21"/>
+                <w:szCs w:val="21"/>
+              </w:rPr>
+            </w:pPr>
+            <w:r>
+              <w:rPr>
+                <w:rFonts w:cs="Courier New" w:ascii="Calibri" w:hAnsi="Calibri"/>
+                <w:sz w:val="21"/>
+                <w:szCs w:val="21"/>
               </w:rPr>
               <w:t>- The close. Does the ending make new meaning of the thread, in the present and the future, or does it trail off? Does it land?</w:t>
             </w:r>
@@ -912,13 +1094,17 @@
             <w:pPr>
               <w:pStyle w:val="normal1"/>
               <w:spacing w:lineRule="auto" w:line="276" w:before="0" w:after="200"/>
-              <w:rPr/>
-            </w:pPr>
-            <w:r>
-              <w:rPr>
-                <w:rFonts w:cs="Courier New" w:ascii="Courier New" w:hAnsi="Courier New"/>
-                <w:sz w:val="22"/>
-                <w:szCs w:val="22"/>
+              <w:rPr>
+                <w:rFonts w:ascii="Calibri" w:hAnsi="Calibri"/>
+                <w:sz w:val="21"/>
+                <w:szCs w:val="21"/>
+              </w:rPr>
+            </w:pPr>
+            <w:r>
+              <w:rPr>
+                <w:rFonts w:cs="Courier New" w:ascii="Calibri" w:hAnsi="Calibri"/>
+                <w:sz w:val="21"/>
+                <w:szCs w:val="21"/>
               </w:rPr>
               <w:t>- Clarity and voice. Where does a sentence or a scene go slack or sound like anyone? Where does it sound most like them?</w:t>
             </w:r>
@@ -927,13 +1113,17 @@
             <w:pPr>
               <w:pStyle w:val="normal1"/>
               <w:spacing w:lineRule="auto" w:line="276" w:before="0" w:after="200"/>
-              <w:rPr/>
-            </w:pPr>
-            <w:r>
-              <w:rPr>
-                <w:rFonts w:cs="Courier New" w:ascii="Courier New" w:hAnsi="Courier New"/>
-                <w:sz w:val="22"/>
-                <w:szCs w:val="22"/>
+              <w:rPr>
+                <w:rFonts w:ascii="Calibri" w:hAnsi="Calibri"/>
+                <w:sz w:val="21"/>
+                <w:szCs w:val="21"/>
+              </w:rPr>
+            </w:pPr>
+            <w:r>
+              <w:rPr>
+                <w:rFonts w:cs="Courier New" w:ascii="Calibri" w:hAnsi="Calibri"/>
+                <w:sz w:val="21"/>
+                <w:szCs w:val="21"/>
               </w:rPr>
               <w:t>- Earning its place. Is there a scene or a stretch that could go, so the thread reads stronger?</w:t>
             </w:r>
@@ -942,13 +1132,17 @@
             <w:pPr>
               <w:pStyle w:val="normal1"/>
               <w:spacing w:lineRule="auto" w:line="276" w:before="0" w:after="200"/>
-              <w:rPr/>
-            </w:pPr>
-            <w:r>
-              <w:rPr>
-                <w:rFonts w:cs="Courier New" w:ascii="Courier New" w:hAnsi="Courier New"/>
-                <w:sz w:val="22"/>
-                <w:szCs w:val="22"/>
+              <w:rPr>
+                <w:rFonts w:ascii="Calibri" w:hAnsi="Calibri"/>
+                <w:sz w:val="21"/>
+                <w:szCs w:val="21"/>
+              </w:rPr>
+            </w:pPr>
+            <w:r>
+              <w:rPr>
+                <w:rFonts w:cs="Courier New" w:ascii="Calibri" w:hAnsi="Calibri"/>
+                <w:sz w:val="21"/>
+                <w:szCs w:val="21"/>
               </w:rPr>
               <w:t>Talk like Todd. Short, plain, warm, direct. Say what is working first, in specifics. Then name the one or two revisions that would help most, as questions where you can. End by asking what they will change first.</w:t>
             </w:r>
@@ -957,13 +1151,17 @@
             <w:pPr>
               <w:pStyle w:val="normal1"/>
               <w:spacing w:lineRule="auto" w:line="276" w:before="0" w:after="200"/>
-              <w:rPr/>
-            </w:pPr>
-            <w:r>
-              <w:rPr>
-                <w:rFonts w:cs="Courier New" w:ascii="Courier New" w:hAnsi="Courier New"/>
-                <w:sz w:val="22"/>
-                <w:szCs w:val="22"/>
+              <w:rPr>
+                <w:rFonts w:ascii="Calibri" w:hAnsi="Calibri"/>
+                <w:sz w:val="21"/>
+                <w:szCs w:val="21"/>
+              </w:rPr>
+            </w:pPr>
+            <w:r>
+              <w:rPr>
+                <w:rFonts w:cs="Courier New" w:ascii="Calibri" w:hAnsi="Calibri"/>
+                <w:sz w:val="21"/>
+                <w:szCs w:val="21"/>
               </w:rPr>
               <w:t>Rules you never break: you never draft or rewrite any part of the currere, never guess what happened, never supply a memory or a meaning. The thread is theirs, the memories are theirs, the meaning is theirs. You only help them see what they already have.</w:t>
             </w:r>
@@ -1283,6 +1481,7 @@
     <w:qFormat/>
     <w:pPr>
       <w:widowControl/>
+      <w:suppressAutoHyphens w:val="true"/>
       <w:bidi w:val="0"/>
       <w:spacing w:lineRule="auto" w:line="276" w:before="0" w:after="200"/>
       <w:jc w:val="left"/>
@@ -1297,7 +1496,7 @@
     </w:rPr>
   </w:style>
   <w:style w:type="paragraph" w:styleId="Heading1">
-    <w:name w:val="Heading 1"/>
+    <w:name w:val="heading 1"/>
     <w:basedOn w:val="normal1"/>
     <w:next w:val="normal1"/>
     <w:qFormat/>
@@ -1316,7 +1515,7 @@
     </w:rPr>
   </w:style>
   <w:style w:type="paragraph" w:styleId="Heading2">
-    <w:name w:val="Heading 2"/>
+    <w:name w:val="heading 2"/>
     <w:basedOn w:val="normal1"/>
     <w:next w:val="normal1"/>
     <w:qFormat/>
@@ -1335,7 +1534,7 @@
     </w:rPr>
   </w:style>
   <w:style w:type="paragraph" w:styleId="Heading3">
-    <w:name w:val="Heading 3"/>
+    <w:name w:val="heading 3"/>
     <w:basedOn w:val="normal1"/>
     <w:next w:val="normal1"/>
     <w:qFormat/>
@@ -1352,7 +1551,7 @@
     </w:rPr>
   </w:style>
   <w:style w:type="paragraph" w:styleId="Heading4">
-    <w:name w:val="Heading 4"/>
+    <w:name w:val="heading 4"/>
     <w:basedOn w:val="normal1"/>
     <w:next w:val="normal1"/>
     <w:qFormat/>
@@ -1371,7 +1570,7 @@
     </w:rPr>
   </w:style>
   <w:style w:type="paragraph" w:styleId="Heading5">
-    <w:name w:val="Heading 5"/>
+    <w:name w:val="heading 5"/>
     <w:basedOn w:val="normal1"/>
     <w:next w:val="normal1"/>
     <w:qFormat/>
@@ -1386,7 +1585,7 @@
     </w:rPr>
   </w:style>
   <w:style w:type="paragraph" w:styleId="Heading6">
-    <w:name w:val="Heading 6"/>
+    <w:name w:val="heading 6"/>
     <w:basedOn w:val="normal1"/>
     <w:next w:val="normal1"/>
     <w:qFormat/>
@@ -1434,7 +1633,7 @@
     </w:rPr>
   </w:style>
   <w:style w:type="paragraph" w:styleId="Caption">
-    <w:name w:val="Caption"/>
+    <w:name w:val="caption"/>
     <w:basedOn w:val="Normal"/>
     <w:qFormat/>
     <w:pPr>
@@ -1465,6 +1664,7 @@
     <w:qFormat/>
     <w:pPr>
       <w:widowControl/>
+      <w:suppressAutoHyphens w:val="true"/>
       <w:bidi w:val="0"/>
       <w:spacing w:lineRule="auto" w:line="276" w:before="0" w:after="200"/>
       <w:jc w:val="left"/>
@@ -1509,6 +1709,29 @@
       <w:color w:val="4F81BD"/>
       <w:sz w:val="24"/>
       <w:szCs w:val="24"/>
+    </w:rPr>
+  </w:style>
+  <w:style w:type="paragraph" w:styleId="TableContents">
+    <w:name w:val="Table Contents"/>
+    <w:basedOn w:val="Normal"/>
+    <w:qFormat/>
+    <w:pPr>
+      <w:widowControl w:val="false"/>
+      <w:suppressLineNumbers/>
+    </w:pPr>
+    <w:rPr/>
+  </w:style>
+  <w:style w:type="paragraph" w:styleId="TableHeading">
+    <w:name w:val="Table Heading"/>
+    <w:basedOn w:val="TableContents"/>
+    <w:qFormat/>
+    <w:pPr>
+      <w:suppressLineNumbers/>
+      <w:jc w:val="center"/>
+    </w:pPr>
+    <w:rPr>
+      <w:b/>
+      <w:bCs/>
     </w:rPr>
   </w:style>
   <w:style w:type="table" w:default="1" w:styleId="TableNormal">

</xml_diff>